<commit_message>
Meeting note on the final figures; state files after the lock
- Arbitration Cost Update.docx (builder v1.1, 2 pages): star value $18.03M against $31.90M under the
  qualifying-offer chain; traded picks $401.3M against $710.1M; 856 of 7,817 valuations lower than under
  the chain; the market price as now built; September 15 ages; each change scored alone.
- WORK_QUEUE: lock, fetch and note done; next is the prospect model. PROJECT_STATE figures in force,
  CLAUDE.md (the re-locked XNPV1_RATE), MODEL_DIRECTIVES, DECISIONS, session log, MANIFEST.

Co-Authored-By: Claude Opus 5.5 <noreply@anthropic.com>
</commit_message>
<xml_diff>
--- a/40_DOCS/Supervisor_Drafts/Arbitration Cost Update.docx
+++ b/40_DOCS/Supervisor_Drafts/Arbitration Cost Update.docx
@@ -79,7 +79,7 @@
           <w:sz w:val="22"/>
           <w:szCs w:val="22"/>
         </w:rPr>
-        <w:t xml:space="preserve">Now, once a player is eligible for salary arbitration, a control season costs the higher of the qualifying offer and the market price of his recent production. The market price is his last three seasons of WAR, weighted 50/30/20 with the most recent first, priced on the line that prices contracts. Before eligibility, the qualifying offer still applies.</w:t>
+        <w:t xml:space="preserve">Now, once a player is eligible for salary arbitration, a control season costs the higher of the qualifying offer and the market price of his production. The market price is the contract line's price for the model's own estimate of his level going into that season: his last three seasons' rate per 82 games, weighted 50/30/20 with the most recent first and by games played, pulled 35% toward comparable players, times his expected share of games. It uses only seasons before that one. Before eligibility, the qualifying offer still applies.</w:t>
       </w:r>
     </w:p>
     <w:p>
@@ -133,7 +133,7 @@
           <w:sz w:val="22"/>
           <w:szCs w:val="22"/>
         </w:rPr>
-        <w:t xml:space="preserve">Eligibility follows the CBA (Section 12.1). A player needs four years of professional experience if he first signed at 18-20, three at 21, two at 22-23 and one at 24 or older, with age taken on September 15 of the year he first signed.</w:t>
+        <w:t xml:space="preserve">Eligibility follows the CBA (Section 12.1). A player needs four years of professional experience if he first signed at 18-20, three at 21, two at 22-23 and one at 24 or older, with age taken on September 15 of the year he first signed. For drafted players the signing year comes from PuckPedia and CapWages contract records (1,092 of the 1,157 who played); his first NHL season stands in for the other 65.</w:t>
       </w:r>
     </w:p>
     <w:p>
@@ -170,6 +170,24 @@
           <w:szCs w:val="22"/>
         </w:rPr>
         <w:t xml:space="preserve">For players under contract the model uses PuckPedia's arbitration-eligibility flag on the contract.</w:t>
+      </w:r>
+    </w:p>
+    <w:p>
+      <w:pPr>
+        <w:pStyle w:val="ListParagraph"/>
+        <w:numPr>
+          <w:ilvl w:val="0"/>
+          <w:numId w:val="2"/>
+        </w:numPr>
+        <w:spacing w:after="60"/>
+      </w:pPr>
+      <w:r>
+        <w:rPr>
+          <w:rFonts w:ascii="Calibri" w:cs="Calibri" w:eastAsia="Calibri" w:hAnsi="Calibri"/>
+          <w:sz w:val="22"/>
+          <w:szCs w:val="22"/>
+        </w:rPr>
+        <w:t xml:space="preserve">Every age in the model is now read on September 15 of the season's first year, the date the CBA uses, instead of February 1 of its second year. The price line was re-estimated on the new ages: $1.673 million per forecast win for forwards (from $1.668 million), $2.043 million for defencemen (from $2.012 million).</w:t>
       </w:r>
     </w:p>
     <w:p>
@@ -203,7 +221,7 @@
           <w:sz w:val="22"/>
           <w:szCs w:val="22"/>
         </w:rPr>
-        <w:t xml:space="preserve">The star value, which is the surplus a pick would be worth if its player were certain to become a star, falls from $31.66 million to $13.42 million (standard error 1.44). Without the 2015 and 2016 drafts it falls from $27.58 million to $11.13 million.</w:t>
+        <w:t xml:space="preserve">The star value, which is the surplus a pick would be worth if its player were certain to become a star, is $18.03 million (standard error 1.73) against $31.90 million under the qualifying-offer chain. Without the 2015 and 2016 drafts it is $15.68 million against $27.82 million.</w:t>
       </w:r>
     </w:p>
     <w:p>
@@ -221,7 +239,7 @@
           <w:sz w:val="22"/>
           <w:szCs w:val="22"/>
         </w:rPr>
-        <w:t xml:space="preserve">Of the 2,833 control seasons drafted players played, 1,776 were arbitration-eligible and 1,145 are now priced above the qualifying offer. For first-round picks who played, the cost of control seasons is now 1.80 times the chain's for picks 1-10 and 1.45 times for picks 11-32. It remains below what teams actually paid.</w:t>
+        <w:t xml:space="preserve">Of the 2,658 control seasons drafted players played, 1,488 were priced at the market price and 1,103 of those cost more than the qualifying offer. For first-round picks who played, the cost of control seasons is now 1.61 times the chain's for picks 1-10 and 1.34 times for picks 11-32. It remains below what teams actually paid.</w:t>
       </w:r>
     </w:p>
     <w:p>
@@ -323,7 +341,7 @@
                 <w:sz w:val="20"/>
                 <w:szCs w:val="20"/>
               </w:rPr>
-              <w:t xml:space="preserve">Before ($M)</w:t>
+              <w:t xml:space="preserve">Qualifying-offer chain ($M)</w:t>
             </w:r>
           </w:p>
         </w:tc>
@@ -355,7 +373,7 @@
                 <w:sz w:val="20"/>
                 <w:szCs w:val="20"/>
               </w:rPr>
-              <w:t xml:space="preserve">Now ($M)</w:t>
+              <w:t xml:space="preserve">Market price rule ($M)</w:t>
             </w:r>
           </w:p>
         </w:tc>
@@ -421,39 +439,39 @@
                 <w:sz w:val="20"/>
                 <w:szCs w:val="20"/>
               </w:rPr>
-              <w:t xml:space="preserve">23.67</w:t>
-            </w:r>
-          </w:p>
-        </w:tc>
-        <w:tc>
-          <w:tcPr>
-            <w:tcW w:type="dxa" w:w="2340"/>
-            <w:tcBorders>
-              <w:top w:val="single" w:color="999999" w:sz="4"/>
-              <w:left w:val="single" w:color="999999" w:sz="4"/>
-              <w:bottom w:val="single" w:color="999999" w:sz="4"/>
-              <w:right w:val="single" w:color="999999" w:sz="4"/>
-            </w:tcBorders>
-            <w:tcMar>
-              <w:top w:type="dxa" w:w="40"/>
-              <w:left w:type="dxa" w:w="100"/>
-              <w:bottom w:type="dxa" w:w="40"/>
-              <w:right w:type="dxa" w:w="100"/>
-            </w:tcMar>
-          </w:tcPr>
-          <w:p>
-            <w:pPr>
-              <w:jc w:val="center"/>
-            </w:pPr>
-            <w:r>
-              <w:rPr>
-                <w:rFonts w:ascii="Calibri" w:cs="Calibri" w:eastAsia="Calibri" w:hAnsi="Calibri"/>
-                <w:b w:val="false"/>
-                <w:bCs w:val="false"/>
-                <w:sz w:val="20"/>
-                <w:szCs w:val="20"/>
-              </w:rPr>
-              <w:t xml:space="preserve">10.03</w:t>
+              <w:t xml:space="preserve">23.85</w:t>
+            </w:r>
+          </w:p>
+        </w:tc>
+        <w:tc>
+          <w:tcPr>
+            <w:tcW w:type="dxa" w:w="2340"/>
+            <w:tcBorders>
+              <w:top w:val="single" w:color="999999" w:sz="4"/>
+              <w:left w:val="single" w:color="999999" w:sz="4"/>
+              <w:bottom w:val="single" w:color="999999" w:sz="4"/>
+              <w:right w:val="single" w:color="999999" w:sz="4"/>
+            </w:tcBorders>
+            <w:tcMar>
+              <w:top w:type="dxa" w:w="40"/>
+              <w:left w:type="dxa" w:w="100"/>
+              <w:bottom w:type="dxa" w:w="40"/>
+              <w:right w:type="dxa" w:w="100"/>
+            </w:tcMar>
+          </w:tcPr>
+          <w:p>
+            <w:pPr>
+              <w:jc w:val="center"/>
+            </w:pPr>
+            <w:r>
+              <w:rPr>
+                <w:rFonts w:ascii="Calibri" w:cs="Calibri" w:eastAsia="Calibri" w:hAnsi="Calibri"/>
+                <w:b w:val="false"/>
+                <w:bCs w:val="false"/>
+                <w:sz w:val="20"/>
+                <w:szCs w:val="20"/>
+              </w:rPr>
+              <w:t xml:space="preserve">13.48</w:t>
             </w:r>
           </w:p>
         </w:tc>
@@ -519,39 +537,39 @@
                 <w:sz w:val="20"/>
                 <w:szCs w:val="20"/>
               </w:rPr>
-              <w:t xml:space="preserve">18.68</w:t>
-            </w:r>
-          </w:p>
-        </w:tc>
-        <w:tc>
-          <w:tcPr>
-            <w:tcW w:type="dxa" w:w="2340"/>
-            <w:tcBorders>
-              <w:top w:val="single" w:color="999999" w:sz="4"/>
-              <w:left w:val="single" w:color="999999" w:sz="4"/>
-              <w:bottom w:val="single" w:color="999999" w:sz="4"/>
-              <w:right w:val="single" w:color="999999" w:sz="4"/>
-            </w:tcBorders>
-            <w:tcMar>
-              <w:top w:type="dxa" w:w="40"/>
-              <w:left w:type="dxa" w:w="100"/>
-              <w:bottom w:type="dxa" w:w="40"/>
-              <w:right w:type="dxa" w:w="100"/>
-            </w:tcMar>
-          </w:tcPr>
-          <w:p>
-            <w:pPr>
-              <w:jc w:val="center"/>
-            </w:pPr>
-            <w:r>
-              <w:rPr>
-                <w:rFonts w:ascii="Calibri" w:cs="Calibri" w:eastAsia="Calibri" w:hAnsi="Calibri"/>
-                <w:b w:val="false"/>
-                <w:bCs w:val="false"/>
-                <w:sz w:val="20"/>
-                <w:szCs w:val="20"/>
-              </w:rPr>
-              <w:t xml:space="preserve">7.92</w:t>
+              <w:t xml:space="preserve">18.82</w:t>
+            </w:r>
+          </w:p>
+        </w:tc>
+        <w:tc>
+          <w:tcPr>
+            <w:tcW w:type="dxa" w:w="2340"/>
+            <w:tcBorders>
+              <w:top w:val="single" w:color="999999" w:sz="4"/>
+              <w:left w:val="single" w:color="999999" w:sz="4"/>
+              <w:bottom w:val="single" w:color="999999" w:sz="4"/>
+              <w:right w:val="single" w:color="999999" w:sz="4"/>
+            </w:tcBorders>
+            <w:tcMar>
+              <w:top w:type="dxa" w:w="40"/>
+              <w:left w:type="dxa" w:w="100"/>
+              <w:bottom w:type="dxa" w:w="40"/>
+              <w:right w:type="dxa" w:w="100"/>
+            </w:tcMar>
+          </w:tcPr>
+          <w:p>
+            <w:pPr>
+              <w:jc w:val="center"/>
+            </w:pPr>
+            <w:r>
+              <w:rPr>
+                <w:rFonts w:ascii="Calibri" w:cs="Calibri" w:eastAsia="Calibri" w:hAnsi="Calibri"/>
+                <w:b w:val="false"/>
+                <w:bCs w:val="false"/>
+                <w:sz w:val="20"/>
+                <w:szCs w:val="20"/>
+              </w:rPr>
+              <w:t xml:space="preserve">10.63</w:t>
             </w:r>
           </w:p>
         </w:tc>
@@ -617,39 +635,39 @@
                 <w:sz w:val="20"/>
                 <w:szCs w:val="20"/>
               </w:rPr>
-              <w:t xml:space="preserve">11.29</w:t>
-            </w:r>
-          </w:p>
-        </w:tc>
-        <w:tc>
-          <w:tcPr>
-            <w:tcW w:type="dxa" w:w="2340"/>
-            <w:tcBorders>
-              <w:top w:val="single" w:color="999999" w:sz="4"/>
-              <w:left w:val="single" w:color="999999" w:sz="4"/>
-              <w:bottom w:val="single" w:color="999999" w:sz="4"/>
-              <w:right w:val="single" w:color="999999" w:sz="4"/>
-            </w:tcBorders>
-            <w:tcMar>
-              <w:top w:type="dxa" w:w="40"/>
-              <w:left w:type="dxa" w:w="100"/>
-              <w:bottom w:type="dxa" w:w="40"/>
-              <w:right w:type="dxa" w:w="100"/>
-            </w:tcMar>
-          </w:tcPr>
-          <w:p>
-            <w:pPr>
-              <w:jc w:val="center"/>
-            </w:pPr>
-            <w:r>
-              <w:rPr>
-                <w:rFonts w:ascii="Calibri" w:cs="Calibri" w:eastAsia="Calibri" w:hAnsi="Calibri"/>
-                <w:b w:val="false"/>
-                <w:bCs w:val="false"/>
-                <w:sz w:val="20"/>
-                <w:szCs w:val="20"/>
-              </w:rPr>
-              <w:t xml:space="preserve">4.78</w:t>
+              <w:t xml:space="preserve">11.37</w:t>
+            </w:r>
+          </w:p>
+        </w:tc>
+        <w:tc>
+          <w:tcPr>
+            <w:tcW w:type="dxa" w:w="2340"/>
+            <w:tcBorders>
+              <w:top w:val="single" w:color="999999" w:sz="4"/>
+              <w:left w:val="single" w:color="999999" w:sz="4"/>
+              <w:bottom w:val="single" w:color="999999" w:sz="4"/>
+              <w:right w:val="single" w:color="999999" w:sz="4"/>
+            </w:tcBorders>
+            <w:tcMar>
+              <w:top w:type="dxa" w:w="40"/>
+              <w:left w:type="dxa" w:w="100"/>
+              <w:bottom w:type="dxa" w:w="40"/>
+              <w:right w:type="dxa" w:w="100"/>
+            </w:tcMar>
+          </w:tcPr>
+          <w:p>
+            <w:pPr>
+              <w:jc w:val="center"/>
+            </w:pPr>
+            <w:r>
+              <w:rPr>
+                <w:rFonts w:ascii="Calibri" w:cs="Calibri" w:eastAsia="Calibri" w:hAnsi="Calibri"/>
+                <w:b w:val="false"/>
+                <w:bCs w:val="false"/>
+                <w:sz w:val="20"/>
+                <w:szCs w:val="20"/>
+              </w:rPr>
+              <w:t xml:space="preserve">6.43</w:t>
             </w:r>
           </w:p>
         </w:tc>
@@ -715,39 +733,39 @@
                 <w:sz w:val="20"/>
                 <w:szCs w:val="20"/>
               </w:rPr>
-              <w:t xml:space="preserve">6.71</w:t>
-            </w:r>
-          </w:p>
-        </w:tc>
-        <w:tc>
-          <w:tcPr>
-            <w:tcW w:type="dxa" w:w="2340"/>
-            <w:tcBorders>
-              <w:top w:val="single" w:color="999999" w:sz="4"/>
-              <w:left w:val="single" w:color="999999" w:sz="4"/>
-              <w:bottom w:val="single" w:color="999999" w:sz="4"/>
-              <w:right w:val="single" w:color="999999" w:sz="4"/>
-            </w:tcBorders>
-            <w:tcMar>
-              <w:top w:type="dxa" w:w="40"/>
-              <w:left w:type="dxa" w:w="100"/>
-              <w:bottom w:type="dxa" w:w="40"/>
-              <w:right w:type="dxa" w:w="100"/>
-            </w:tcMar>
-          </w:tcPr>
-          <w:p>
-            <w:pPr>
-              <w:jc w:val="center"/>
-            </w:pPr>
-            <w:r>
-              <w:rPr>
-                <w:rFonts w:ascii="Calibri" w:cs="Calibri" w:eastAsia="Calibri" w:hAnsi="Calibri"/>
-                <w:b w:val="false"/>
-                <w:bCs w:val="false"/>
-                <w:sz w:val="20"/>
-                <w:szCs w:val="20"/>
-              </w:rPr>
-              <w:t xml:space="preserve">2.85</w:t>
+              <w:t xml:space="preserve">6.76</w:t>
+            </w:r>
+          </w:p>
+        </w:tc>
+        <w:tc>
+          <w:tcPr>
+            <w:tcW w:type="dxa" w:w="2340"/>
+            <w:tcBorders>
+              <w:top w:val="single" w:color="999999" w:sz="4"/>
+              <w:left w:val="single" w:color="999999" w:sz="4"/>
+              <w:bottom w:val="single" w:color="999999" w:sz="4"/>
+              <w:right w:val="single" w:color="999999" w:sz="4"/>
+            </w:tcBorders>
+            <w:tcMar>
+              <w:top w:type="dxa" w:w="40"/>
+              <w:left w:type="dxa" w:w="100"/>
+              <w:bottom w:type="dxa" w:w="40"/>
+              <w:right w:type="dxa" w:w="100"/>
+            </w:tcMar>
+          </w:tcPr>
+          <w:p>
+            <w:pPr>
+              <w:jc w:val="center"/>
+            </w:pPr>
+            <w:r>
+              <w:rPr>
+                <w:rFonts w:ascii="Calibri" w:cs="Calibri" w:eastAsia="Calibri" w:hAnsi="Calibri"/>
+                <w:b w:val="false"/>
+                <w:bCs w:val="false"/>
+                <w:sz w:val="20"/>
+                <w:szCs w:val="20"/>
+              </w:rPr>
+              <w:t xml:space="preserve">3.82</w:t>
             </w:r>
           </w:p>
         </w:tc>
@@ -813,39 +831,39 @@
                 <w:sz w:val="20"/>
                 <w:szCs w:val="20"/>
               </w:rPr>
-              <w:t xml:space="preserve">3.66</w:t>
-            </w:r>
-          </w:p>
-        </w:tc>
-        <w:tc>
-          <w:tcPr>
-            <w:tcW w:type="dxa" w:w="2340"/>
-            <w:tcBorders>
-              <w:top w:val="single" w:color="999999" w:sz="4"/>
-              <w:left w:val="single" w:color="999999" w:sz="4"/>
-              <w:bottom w:val="single" w:color="999999" w:sz="4"/>
-              <w:right w:val="single" w:color="999999" w:sz="4"/>
-            </w:tcBorders>
-            <w:tcMar>
-              <w:top w:type="dxa" w:w="40"/>
-              <w:left w:type="dxa" w:w="100"/>
-              <w:bottom w:type="dxa" w:w="40"/>
-              <w:right w:type="dxa" w:w="100"/>
-            </w:tcMar>
-          </w:tcPr>
-          <w:p>
-            <w:pPr>
-              <w:jc w:val="center"/>
-            </w:pPr>
-            <w:r>
-              <w:rPr>
-                <w:rFonts w:ascii="Calibri" w:cs="Calibri" w:eastAsia="Calibri" w:hAnsi="Calibri"/>
-                <w:b w:val="false"/>
-                <w:bCs w:val="false"/>
-                <w:sz w:val="20"/>
-                <w:szCs w:val="20"/>
-              </w:rPr>
-              <w:t xml:space="preserve">1.55</w:t>
+              <w:t xml:space="preserve">3.69</w:t>
+            </w:r>
+          </w:p>
+        </w:tc>
+        <w:tc>
+          <w:tcPr>
+            <w:tcW w:type="dxa" w:w="2340"/>
+            <w:tcBorders>
+              <w:top w:val="single" w:color="999999" w:sz="4"/>
+              <w:left w:val="single" w:color="999999" w:sz="4"/>
+              <w:bottom w:val="single" w:color="999999" w:sz="4"/>
+              <w:right w:val="single" w:color="999999" w:sz="4"/>
+            </w:tcBorders>
+            <w:tcMar>
+              <w:top w:type="dxa" w:w="40"/>
+              <w:left w:type="dxa" w:w="100"/>
+              <w:bottom w:type="dxa" w:w="40"/>
+              <w:right w:type="dxa" w:w="100"/>
+            </w:tcMar>
+          </w:tcPr>
+          <w:p>
+            <w:pPr>
+              <w:jc w:val="center"/>
+            </w:pPr>
+            <w:r>
+              <w:rPr>
+                <w:rFonts w:ascii="Calibri" w:cs="Calibri" w:eastAsia="Calibri" w:hAnsi="Calibri"/>
+                <w:b w:val="false"/>
+                <w:bCs w:val="false"/>
+                <w:sz w:val="20"/>
+                <w:szCs w:val="20"/>
+              </w:rPr>
+              <w:t xml:space="preserve">2.08</w:t>
             </w:r>
           </w:p>
         </w:tc>
@@ -911,39 +929,39 @@
                 <w:sz w:val="20"/>
                 <w:szCs w:val="20"/>
               </w:rPr>
-              <w:t xml:space="preserve">2.35</w:t>
-            </w:r>
-          </w:p>
-        </w:tc>
-        <w:tc>
-          <w:tcPr>
-            <w:tcW w:type="dxa" w:w="2340"/>
-            <w:tcBorders>
-              <w:top w:val="single" w:color="999999" w:sz="4"/>
-              <w:left w:val="single" w:color="999999" w:sz="4"/>
-              <w:bottom w:val="single" w:color="999999" w:sz="4"/>
-              <w:right w:val="single" w:color="999999" w:sz="4"/>
-            </w:tcBorders>
-            <w:tcMar>
-              <w:top w:type="dxa" w:w="40"/>
-              <w:left w:type="dxa" w:w="100"/>
-              <w:bottom w:type="dxa" w:w="40"/>
-              <w:right w:type="dxa" w:w="100"/>
-            </w:tcMar>
-          </w:tcPr>
-          <w:p>
-            <w:pPr>
-              <w:jc w:val="center"/>
-            </w:pPr>
-            <w:r>
-              <w:rPr>
-                <w:rFonts w:ascii="Calibri" w:cs="Calibri" w:eastAsia="Calibri" w:hAnsi="Calibri"/>
-                <w:b w:val="false"/>
-                <w:bCs w:val="false"/>
-                <w:sz w:val="20"/>
-                <w:szCs w:val="20"/>
-              </w:rPr>
-              <w:t xml:space="preserve">1.00</w:t>
+              <w:t xml:space="preserve">2.37</w:t>
+            </w:r>
+          </w:p>
+        </w:tc>
+        <w:tc>
+          <w:tcPr>
+            <w:tcW w:type="dxa" w:w="2340"/>
+            <w:tcBorders>
+              <w:top w:val="single" w:color="999999" w:sz="4"/>
+              <w:left w:val="single" w:color="999999" w:sz="4"/>
+              <w:bottom w:val="single" w:color="999999" w:sz="4"/>
+              <w:right w:val="single" w:color="999999" w:sz="4"/>
+            </w:tcBorders>
+            <w:tcMar>
+              <w:top w:type="dxa" w:w="40"/>
+              <w:left w:type="dxa" w:w="100"/>
+              <w:bottom w:type="dxa" w:w="40"/>
+              <w:right w:type="dxa" w:w="100"/>
+            </w:tcMar>
+          </w:tcPr>
+          <w:p>
+            <w:pPr>
+              <w:jc w:val="center"/>
+            </w:pPr>
+            <w:r>
+              <w:rPr>
+                <w:rFonts w:ascii="Calibri" w:cs="Calibri" w:eastAsia="Calibri" w:hAnsi="Calibri"/>
+                <w:b w:val="false"/>
+                <w:bCs w:val="false"/>
+                <w:sz w:val="20"/>
+                <w:szCs w:val="20"/>
+              </w:rPr>
+              <w:t xml:space="preserve">1.34</w:t>
             </w:r>
           </w:p>
         </w:tc>
@@ -1009,39 +1027,39 @@
                 <w:sz w:val="20"/>
                 <w:szCs w:val="20"/>
               </w:rPr>
-              <w:t xml:space="preserve">1.19</w:t>
-            </w:r>
-          </w:p>
-        </w:tc>
-        <w:tc>
-          <w:tcPr>
-            <w:tcW w:type="dxa" w:w="2340"/>
-            <w:tcBorders>
-              <w:top w:val="single" w:color="999999" w:sz="4"/>
-              <w:left w:val="single" w:color="999999" w:sz="4"/>
-              <w:bottom w:val="single" w:color="999999" w:sz="4"/>
-              <w:right w:val="single" w:color="999999" w:sz="4"/>
-            </w:tcBorders>
-            <w:tcMar>
-              <w:top w:type="dxa" w:w="40"/>
-              <w:left w:type="dxa" w:w="100"/>
-              <w:bottom w:type="dxa" w:w="40"/>
-              <w:right w:type="dxa" w:w="100"/>
-            </w:tcMar>
-          </w:tcPr>
-          <w:p>
-            <w:pPr>
-              <w:jc w:val="center"/>
-            </w:pPr>
-            <w:r>
-              <w:rPr>
-                <w:rFonts w:ascii="Calibri" w:cs="Calibri" w:eastAsia="Calibri" w:hAnsi="Calibri"/>
-                <w:b w:val="false"/>
-                <w:bCs w:val="false"/>
-                <w:sz w:val="20"/>
-                <w:szCs w:val="20"/>
-              </w:rPr>
-              <w:t xml:space="preserve">0.50</w:t>
+              <w:t xml:space="preserve">1.20</w:t>
+            </w:r>
+          </w:p>
+        </w:tc>
+        <w:tc>
+          <w:tcPr>
+            <w:tcW w:type="dxa" w:w="2340"/>
+            <w:tcBorders>
+              <w:top w:val="single" w:color="999999" w:sz="4"/>
+              <w:left w:val="single" w:color="999999" w:sz="4"/>
+              <w:bottom w:val="single" w:color="999999" w:sz="4"/>
+              <w:right w:val="single" w:color="999999" w:sz="4"/>
+            </w:tcBorders>
+            <w:tcMar>
+              <w:top w:type="dxa" w:w="40"/>
+              <w:left w:type="dxa" w:w="100"/>
+              <w:bottom w:type="dxa" w:w="40"/>
+              <w:right w:type="dxa" w:w="100"/>
+            </w:tcMar>
+          </w:tcPr>
+          <w:p>
+            <w:pPr>
+              <w:jc w:val="center"/>
+            </w:pPr>
+            <w:r>
+              <w:rPr>
+                <w:rFonts w:ascii="Calibri" w:cs="Calibri" w:eastAsia="Calibri" w:hAnsi="Calibri"/>
+                <w:b w:val="false"/>
+                <w:bCs w:val="false"/>
+                <w:sz w:val="20"/>
+                <w:szCs w:val="20"/>
+              </w:rPr>
+              <w:t xml:space="preserve">0.68</w:t>
             </w:r>
           </w:p>
         </w:tc>
@@ -1139,7 +1157,7 @@
                 <w:sz w:val="20"/>
                 <w:szCs w:val="20"/>
               </w:rPr>
-              <w:t xml:space="preserve">0.32</w:t>
+              <w:t xml:space="preserve">0.43</w:t>
             </w:r>
           </w:p>
         </w:tc>
@@ -1173,7 +1191,7 @@
           <w:sz w:val="22"/>
           <w:szCs w:val="22"/>
         </w:rPr>
-        <w:t xml:space="preserve">The 634 picks traded from July 2017 to March 2022 were worth $704.8 million in total before the change and $298.8 million now.</w:t>
+        <w:t xml:space="preserve">The 634 picks traded from July 2017 to March 2022 are worth $401.3 million in total, against $710.1 million under the qualifying-offer chain.</w:t>
       </w:r>
     </w:p>
     <w:p>
@@ -1207,7 +1225,7 @@
           <w:sz w:val="22"/>
           <w:szCs w:val="22"/>
         </w:rPr>
-        <w:t xml:space="preserve">811 of the 7,817 contract valuations in the panel (seasons 2018-19 to 2026-27) fall and none rise. These are 811 of the 883 valuations that carried control-season value. The median fall is $0.81 million and the largest is $17.32 million.</w:t>
+        <w:t xml:space="preserve">856 of the 7,817 contract valuations in the panel (seasons 2018-19 to 2026-27) are lower than under the qualifying-offer chain, and none are higher. These are 856 of the 882 valuations that carry control-season value. The median fall is $0.81 million and the largest is $15.66 million.</w:t>
       </w:r>
     </w:p>
     <w:p>
@@ -1225,7 +1243,7 @@
           <w:sz w:val="22"/>
           <w:szCs w:val="22"/>
         </w:rPr>
-        <w:t xml:space="preserve">The players affected are young players with control seasons still ahead. On the 2025-26 list, Matvei Michkov falls from $20.81 million to $12.13 million, Macklin Celebrini from $19.38 million to $11.31 million and Marco Kasper from $16.59 million to $9.87 million.</w:t>
+        <w:t xml:space="preserve">The players affected are young players with control seasons still ahead. On the 2025-26 list, Matvei Michkov is valued at $12.82 million against $21.47 million under the chain, Macklin Celebrini at $12.03 million against $19.83 million and Marco Kasper at $9.63 million against $16.30 million.</w:t>
       </w:r>
     </w:p>
     <w:p>
@@ -1243,7 +1261,7 @@
           <w:sz w:val="22"/>
           <w:szCs w:val="22"/>
         </w:rPr>
-        <w:t xml:space="preserve">17 of the top 20 contracts stay in the top 20 on both the 2024-25 and the 2025-26 lists. Players on long contracts with no control seasons left are not affected.</w:t>
+        <w:t xml:space="preserve">16 of the top 20 contracts on the 2024-25 list and 17 of 20 on the 2025-26 list stay in the top 20. Players on long contracts with no control seasons left are not affected.</w:t>
       </w:r>
     </w:p>
     <w:p>
@@ -1277,7 +1295,7 @@
           <w:sz w:val="22"/>
           <w:szCs w:val="22"/>
         </w:rPr>
-        <w:t xml:space="preserve">The former cost still reproduces. Re-priced on the qualifying-offer chain, 30 sampled contracts return their former values to the cent. The full rebuild passed each of its 10 steps, including the dashboard's check that each re-priced valuation is within $1 of the panel.</w:t>
+        <w:t xml:space="preserve">The full rebuild passed each of its 10 steps, including the dashboard's check that each re-priced valuation is within $1 of the panel. The qualifying-offer chain is still priced beside every value.</w:t>
       </w:r>
     </w:p>
     <w:p>
@@ -1295,7 +1313,7 @@
           <w:sz w:val="22"/>
           <w:szCs w:val="22"/>
         </w:rPr>
-        <w:t xml:space="preserve">Eligibility counted from the CBA agrees with PuckPedia's flag on 64.1% of the 1,656 skater contracts that ended in restricted free agency from 2018-19 to 2024-25. The count is later for 541 contracts, mostly because the data holds no AHL games (323 of the 541 had no season of 10 or more NHL games), and earlier for 53. That is why contracts use the flag.</w:t>
+        <w:t xml:space="preserve">The market price rebuilds the model's starting estimate at each control season. At the season the model itself starts from, the rebuild was checked to equal the model's estimate (to nine decimal places) for every player priced.</w:t>
       </w:r>
     </w:p>
     <w:p>
@@ -1313,6 +1331,24 @@
           <w:sz w:val="22"/>
           <w:szCs w:val="22"/>
         </w:rPr>
+        <w:t xml:space="preserve">Eligibility counted from the CBA agrees with PuckPedia's flag on 64.1% of the 1,656 skater contracts that ended in restricted free agency from 2018-19 to 2024-25. The count is later for 540 contracts, mostly because the data holds no AHL games, and earlier for 54. That is why contracts use the flag.</w:t>
+      </w:r>
+    </w:p>
+    <w:p>
+      <w:pPr>
+        <w:pStyle w:val="ListParagraph"/>
+        <w:numPr>
+          <w:ilvl w:val="0"/>
+          <w:numId w:val="2"/>
+        </w:numPr>
+        <w:spacing w:after="60"/>
+      </w:pPr>
+      <w:r>
+        <w:rPr>
+          <w:rFonts w:ascii="Calibri" w:cs="Calibri" w:eastAsia="Calibri" w:hAnsi="Calibri"/>
+          <w:sz w:val="22"/>
+          <w:szCs w:val="22"/>
+        </w:rPr>
         <w:t xml:space="preserve">Where PuckPedia marks a player not yet eligible when his contract ends, the model makes him eligible from his second control season. Of the 225 such players who then signed a one-year restricted contract, 92.4% were eligible at its end.</w:t>
       </w:r>
     </w:p>
@@ -1349,7 +1385,7 @@
           <w:sz w:val="22"/>
           <w:szCs w:val="22"/>
         </w:rPr>
-        <w:t xml:space="preserve">Fitting the star value with a constant on the new cost gives $13.53 million (standard error 1.69) against $13.42 million without one. The constant is -$0.02 million a pick at an average draft (p = 0.77).</w:t>
+        <w:t xml:space="preserve">Fitting the star value with a constant gives $17.70 million (standard error 2.02) against $18.03 million without one. The constant is $0.07 million a pick at an average draft (p = 0.44).</w:t>
       </w:r>
     </w:p>
     <w:p>
@@ -1367,12 +1403,30 @@
           <w:sz w:val="22"/>
           <w:szCs w:val="22"/>
         </w:rPr>
-        <w:t xml:space="preserve">None of the 634 traded picks is for a draft inside the drafts the star value is fitted on (2007-2017). Each is for a draft from 2018 to 2025, so no traded pick's value contains its own outcome. Leaving one draft out of the fit moves the star value between $12.09 million (without 2015) and $14.59 million (without 2012).</w:t>
+        <w:t xml:space="preserve">Each change was scored on its own, on the same drafts: the arbitration rule with the earlier market price (the last three seasons' WAR, 50/30/20) gives $13.53 million; reading ages in the signing year alone, $13.82 million; the model-based market price alone, $17.75 million; both, $18.03 million.</w:t>
+      </w:r>
+    </w:p>
+    <w:p>
+      <w:pPr>
+        <w:pStyle w:val="ListParagraph"/>
+        <w:numPr>
+          <w:ilvl w:val="0"/>
+          <w:numId w:val="2"/>
+        </w:numPr>
+        <w:spacing w:after="60"/>
+      </w:pPr>
+      <w:r>
+        <w:rPr>
+          <w:rFonts w:ascii="Calibri" w:cs="Calibri" w:eastAsia="Calibri" w:hAnsi="Calibri"/>
+          <w:sz w:val="22"/>
+          <w:szCs w:val="22"/>
+        </w:rPr>
+        <w:t xml:space="preserve">None of the 634 traded picks is for a draft inside the drafts the star value is fitted on (2007-2017). Each is for a draft from 2018 to 2025, so no traded pick's value contains its own outcome. Leaving one draft out of the fit moves the star value between $16.59 million (without 2015) and $19.37 million (without 2012).</w:t>
       </w:r>
     </w:p>
     <w:sectPr>
       <w:pgSz w:w="12240" w:h="15840" w:orient="portrait"/>
-      <w:pgMar w:top="1300" w:right="1300" w:bottom="1300" w:left="1300" w:header="708" w:footer="708" w:gutter="0"/>
+      <w:pgMar w:top="1080" w:right="1200" w:bottom="1080" w:left="1200" w:header="708" w:footer="708" w:gutter="0"/>
       <w:pgNumType/>
       <w:docGrid w:linePitch="360"/>
     </w:sectPr>

</xml_diff>